<commit_message>
Автоотчёт: 2026-07-14 08:01 UTC
</commit_message>
<xml_diff>
--- a/reports/tengrinews_politics_report_2026-07-14.docx
+++ b/reports/tengrinews_politics_report_2026-07-14.docx
@@ -17,21 +17,13 @@
           <w:color w:val="555555"/>
           <w:sz w:val="22"/>
         </w:rPr>
-        <w:t>Период: 12.07.2026 — 14.07.2026</w:t>
+        <w:t>Период: 07.07.2026 — 14.07.2026</w:t>
       </w:r>
     </w:p>
     <w:p/>
     <w:p>
-      <w:pPr>
-        <w:pStyle w:val="Heading2"/>
-      </w:pPr>
       <w:r>
-        <w:t>1. Краткое резюме периода</w:t>
-      </w:r>
-    </w:p>
-    <w:p>
-      <w:r>
-        <w:t>Анализируемый период (13–14 июля 2026 года) характеризуется преобладанием внутренней социально-экономической и региональной повестки Казахстана. Ключевыми темами публикаций стали вопросы владения недвижимостью и ее доступности для граждан, урбанистическое развитие Алматы, а также обеспечение общественной безопасности и детского здравоохранения. Внешнеполитический вектор и международная повестка в материалах практически не представлены, за исключением исторического экскурса и упоминания частных случаев с гражданами РК за рубежом.</w:t>
+        <w:t>Вот структурированный аналитический отчёт, подготовленный на основе предоставленных материалов казахстанского новостного портала Tengrinews.kz за июль 2026 года.</w:t>
       </w:r>
     </w:p>
     <w:p>
@@ -44,32 +36,40 @@
         <w:pStyle w:val="Heading2"/>
       </w:pPr>
       <w:r>
+        <w:t>1. Краткое резюме периода</w:t>
+      </w:r>
+    </w:p>
+    <w:p>
+      <w:r>
+        <w:t>Рассматриваемый период характеризуется фокусом на вопросах конституционного права, социально-экономического развития регионов и демографических изменений в Казахстане. В экспертном поле обсуждаются правовые рамки президентского мандата и стабильность политической системы. В социально-экономической сфере ключевыми темами стали высокая концентрация собственности на рынке жилья, модернизация городской инфраструктуры Алматы и доступность государственной системы здравоохранения. Также фиксируются изменения в семейно-демографическом поведении граждан, в частности рост числа поздних браков.</w:t>
+      </w:r>
+    </w:p>
+    <w:p>
+      <w:pPr>
+        <w:pStyle w:val="Heading2"/>
+      </w:pPr>
+      <w:r>
         <w:t>2. Ключевые темы и события</w:t>
       </w:r>
     </w:p>
     <w:p>
       <w:r>
-        <w:t>*   **Рынок недвижимости и социальное равенство:** Анализ структуры собственности жилья в Казахстане выявил высокую концентрацию активов у узкого круга лиц. На фоне инфляции недвижимость всё чаще рассматривается гражданами как инструмент сбережения капитала, а не только как социальное благо [3].</w:t>
+        <w:t>*   **Конституционно-политические дискуссии:** Обсуждение экспертным сообществом права действующего Президента Касым-Жомарта Токаева баллотироваться на выборах. Данный механизм рассматривается аналитиками как «политический предохранитель» стабильности государственной системы.</w:t>
       </w:r>
     </w:p>
     <w:p>
       <w:r>
-        <w:t>*   **Развитие городской среды и безопасность в мегаполисах:** Рассматриваются вопросы долгосрочного планирования южной столицы (Генеральный план Алматы) и специфика работы местных правоохранительных органов на уровне микрорайонов [1], [2].</w:t>
+        <w:t>*   **Рынок недвижимости и урбанистика:** Презентация и обсуждение Генерального плана Алматы. Параллельно опубликован анализ структуры собственности на жилье, выявивший высокий уровень концентрации активов (более 5,5 миллиона граждан владеют недвижимостью, однако фиксируются случаи концентрации сотен объектов у единичных собственников, что превращает жилье из социального блага в инвестиционный инструмент).</w:t>
       </w:r>
     </w:p>
     <w:p>
       <w:r>
-        <w:t>*   **Общественное здравоохранение и детская безопасность:** Поднимаются критические вопросы профилактики бытового детского травматизма и оперативности оказания экстренной хирургической помощи в стране [4].</w:t>
+        <w:t>*   **Социальная политика и здравоохранение:** Разъяснение эффективности государственных программ скрининга онкологических заболеваний в Казахстане (бесплатные обследования на рак шейки матки, молочной железы и колоректальный рак для целевых возрастных групп).</w:t>
       </w:r>
     </w:p>
     <w:p>
       <w:r>
-        <w:t>*   **Историческое наследие и государственность:** Обращение к историческому опыту парламентского представительства казахов на примере дореволюционного периода [5].</w:t>
-      </w:r>
-    </w:p>
-    <w:p>
-      <w:r>
-        <w:t>---</w:t>
+        <w:t>*   **Общественная безопасность и демография:** Анализ повседневной работы правоохранительных органов (участковых инспекторов Алматы) и исследование причин роста числа браков среди граждан старше 40 лет.</w:t>
       </w:r>
     </w:p>
     <w:p>
@@ -82,17 +82,17 @@
     </w:p>
     <w:p>
       <w:r>
-        <w:t>*   **Анализ жилищного фонда и структуры собственности:** По данным Единого государственного кадастра недвижимости (ЕГКН) на конец июня 2026 года, собственниками жилья числятся более 5,5 миллиона казахстанцев. При этом наблюдается выраженное неравенство: большинство (4,29 млн человек) владеют только одним объектом, тогда как группа из 47 граждан владеет более чем 100 объектами каждый (максимальный показатель — 773 объекта у одного владельца). Эксперты связывают это с тем, что из-за инфляции и дефицита альтернативных инструментов инвестирования недвижимость в РК превращается в инвестиционный актив. При этом жилищный фонд страны за 5 лет (с 2020 по 2025 год) вырос на 20%, достигнув 447,3 миллиона кв. метров [3].</w:t>
+        <w:t>*   **Дискуссия о президентском мандате:** В центре внимания внутренней политики находится обсуждение экспертами правовых аспектов участия Касым-Жомарта Токаева в будущих выборах. Данный дискурс важен для понимания транзита власти и устойчивости электоральной системы Казахстана.</w:t>
       </w:r>
     </w:p>
     <w:p>
       <w:r>
-        <w:t>*   **Урбанистика и местное управление:** Ключевым инфраструктурным событием стало обсуждение Генерального плана Алматы, определяющего контуры развития крупнейшего мегаполиса страны [1]. Параллельно освещается деятельность участковых инспекторов полиции Алматы, направленная на поддержание правопорядка на местах [2].</w:t>
+        <w:t>*   **Градостроительная политика:** Важным административным событием стало обсуждение Генерального плана Алматы — крупнейшего мегаполиса страны, что напрямую влияет на качество жизни населения, инфраструктуру и сейсмическую безопасность.</w:t>
       </w:r>
     </w:p>
     <w:p>
       <w:r>
-        <w:t>---</w:t>
+        <w:t>*   **Реформы в сфере здравоохранения:** Государство продолжает развивать систему бесплатного онкологического скрининга для раннего выявления заболеваний. Действуют программы бесплатной маммографии (для женщин 40–70 лет раз в два года), ПАП-тестов (для женщин 30–70 лет раз в четыре года) и FIT-тестов на колоректальный рак (для граждан 50–70 лет раз в два года).</w:t>
       </w:r>
     </w:p>
     <w:p>
@@ -105,17 +105,7 @@
     </w:p>
     <w:p>
       <w:r>
-        <w:t>*   **Профилактика рисков для граждан за рубежом:** В контексте детского здравоохранения упомянут инцидент с девятимесячным казахстанским ребенком во Вьетнаме, которому потребовалась экстренная помощь после проглатывания инородного предмета [4].</w:t>
-      </w:r>
-    </w:p>
-    <w:p>
-      <w:r>
-        <w:t>*   **Историко-дипломатический контекст:** Опубликован исторический материал о пяти депутатах-казахах, вошедших в состав первой Государственной думы Российской империи, что отражает давние традиции интеграции и представительства интересов региона в межгосударственных структурах прошлого [5].</w:t>
-      </w:r>
-    </w:p>
-    <w:p>
-      <w:r>
-        <w:t>---</w:t>
+        <w:t>В представленных материалах за данный период отсутствуют публикации, напрямую затрагивающие внешнеполитическую деятельность Республики Казахстан или ее участие в международных организациях. Информационная повестка полностью сосредоточена на внутренних социально-экономических, правовых и региональных процессах.</w:t>
       </w:r>
     </w:p>
     <w:p>
@@ -128,17 +118,17 @@
     </w:p>
     <w:p>
       <w:r>
-        <w:t>*   **Риск формирования «поколения арендаторов»:** Из-за тенденции превращения жилья в инструмент сохранения капитала и концентрации недвижимости в руках крупных инвесторов доступность покупки первого жилья для рядовых граждан может снизиться. Стоит отслеживать, предпримет ли правительство меры регуляторного характера (налоги на множественную недвижимость, льготные программы).</w:t>
+        <w:t>*   **Электоральное законодательство:** Стоит ожидать дальнейших разъяснений от юристов и официальных органов касательно конституционных норм, определяющих периодичность и условия участия кандидатов в президентских выборах.</w:t>
       </w:r>
     </w:p>
     <w:p>
       <w:r>
-        <w:t>*   **Недостаток аналитических данных госорганов:** Действующие базы данных («Правительство для граждан») не фиксируют долю граждан, не имеющих жилья, а также не сегментируют несовершеннолетних собственников. Для качественного планирования социальных госпрограмм потребуется модернизация систем учета.</w:t>
+        <w:t>*   **Доступность жилья и социальное неравенство:** Рост жилищного фонда Казахстана на 20% за период 2020–2025 годов сопровождается высокой концентрацией собственности. Превращение недвижимости в защитный инвестиционный актив на фоне инфляции может стимулировать рост цен и привести к формированию устойчивого «поколения арендаторов». Необходимо следить за тем, будут ли внедряться государственные механизмы регулирования или прогрессивного налогообложения для владельцев множественных объектов жилья.</w:t>
       </w:r>
     </w:p>
     <w:p>
       <w:r>
-        <w:t>*   **Реализация инфраструктурных планов Алматы:** Практическое внедрение нового Генерального плана Алматы потребует внимания со стороны бизнеса и населения, так как оно напрямую затронет стоимость земли, зонирование и строительный сектор.</w:t>
+        <w:t>*   **Демографические сдвиги:** Увеличение доли поздних браков (после 40 лет) указывает на изменение модели планирования семьи в Казахстане, что в долгосрочной перспективе может повлиять на показатели рождаемости и потребует корректировки социальной поддержки молодых и зрелых семей.</w:t>
       </w:r>
     </w:p>
     <w:p>
@@ -156,27 +146,65 @@
     </w:p>
     <w:p>
       <w:r>
-        <w:t>1. "Генеральный план Алматы: что важно знать жителям" (14.07.2026) — [https://tengrinews.kz/article/generalnyi-plan-almaty-cto-vazno-znat-ziteliam-4242/](https://tengrinews.kz/article/generalnyi-plan-almaty-cto-vazno-znat-ziteliam-4242/)</w:t>
+        <w:t>1. «Политический предохранитель» – эксперты о праве Токаева баллотироваться на выборах (07.07.2026)</w:t>
       </w:r>
     </w:p>
     <w:p>
       <w:r>
-        <w:t>2. "“От выгула собак до нападения с ножом“. Как выглядит работа алматинского участкового" (14.07.2026) — [https://tengrinews.kz/article/ot-vygula-sobak-napadeniia-nozom-vygliadit-rabota-4239/](https://tengrinews.kz/article/ot-vygula-sobak-napadeniia-nozom-vygliadit-rabota-4239/)</w:t>
+        <w:t>[https://tengrinews.kz/kazakhstan_news/politicheskiy-predohranitel-ekspertyi-prave-tokaeva-603383/](https://tengrinews.kz/kazakhstan_news/politicheskiy-predohranitel-ekspertyi-prave-tokaeva-603383/)</w:t>
+      </w:r>
+    </w:p>
+    <w:p>
+      <w:pPr>
+        <w:pStyle w:val="Heading2"/>
+      </w:pPr>
+      <w:r>
+        <w:t>2. Генеральный план Алматы: что важно знать жителям (14.07.2026)</w:t>
       </w:r>
     </w:p>
     <w:p>
       <w:r>
-        <w:t>3. "“Недвижимость постепенно превращается в актив“. Сколько казахстанцев имеет жильё" (13.07.2026) — [https://tengrinews.kz/tengri-home/article/nedvizimost-postepenno-prevrashhaetsia-aktiv-skolko-4224/](https://tengrinews.kz/tengri-home/article/nedvizimost-postepenno-prevrashhaetsia-aktiv-skolko-4224/)</w:t>
+        <w:t>[https://tengrinews.kz/article/generalnyi-plan-almaty-cto-vazno-znat-ziteliam-4242/](https://tengrinews.kz/article/generalnyi-plan-almaty-cto-vazno-znat-ziteliam-4242/)</w:t>
       </w:r>
     </w:p>
     <w:p>
       <w:r>
-        <w:t>4. "“Лучше приехать зря, чем опоздать“. Хирург — о самых опасных находках в желудках детей" (13.07.2026) — [https://tengrinews.kz/tengri-health/article/lucse-priexat-zria-opozdat-xirurg-samyx-opasnyx-naxodkax-4237/](https://tengrinews.kz/tengri-health/article/lucse-priexat-zria-opozdat-xirurg-samyx-opasnyx-naxodkax-4237/)</w:t>
+        <w:t>3. Почему нельзя провериться на все виды рака сразу - онколог развеяла популярный миф (14.07.2026)</w:t>
       </w:r>
     </w:p>
     <w:p>
       <w:r>
-        <w:t>5. "Новый опыт степи. Как пять депутатов-казахов попали в первую Госдуму Российской империи" (13.07.2026) — [https://tengrinews.kz/article/novyi-opyt-stepi-piat-deputatov-kazaxov-popali-pervuiu-4024/](https://tengrinews.kz/article/novyi-opyt-stepi-piat-deputatov-kazaxov-popali-pervuiu-4024/)</w:t>
+        <w:t>[https://tengrinews.kz/tengri-health/article/pocemu-proveritsia-vse-vidy-raka-srazu-onkolog-razveiala-4236/](https://tengrinews.kz/tengri-health/article/pocemu-proveritsia-vse-vidy-raka-srazu-onkolog-razveiala-4236/)</w:t>
+      </w:r>
+    </w:p>
+    <w:p>
+      <w:r>
+        <w:t>4. «От выгула собак до нападения с ножом». Как выглядит работа алматинского участкового (14.07.2026)</w:t>
+      </w:r>
+    </w:p>
+    <w:p>
+      <w:r>
+        <w:t>[https://tengrinews.kz/article/ot-vygula-sobak-napadeniia-nozom-vygliadit-rabota-4239/](https://tengrinews.kz/article/ot-vygula-sobak-napadeniia-nozom-vygliadit-rabota-4239/)</w:t>
+      </w:r>
+    </w:p>
+    <w:p>
+      <w:r>
+        <w:t>5. В ЗАГС после 40. Почему в Казахстане растет число поздних браков (14.07.2026)</w:t>
+      </w:r>
+    </w:p>
+    <w:p>
+      <w:r>
+        <w:t>[https://tengrinews.kz/article/zags-40-pocemu-kazaxstane-rastet-cislo-pozdnix-brakov-4232/](https://tengrinews.kz/article/zags-40-pocemu-kazaxstane-rastet-cislo-pozdnix-brakov-4232/)</w:t>
+      </w:r>
+    </w:p>
+    <w:p>
+      <w:r>
+        <w:t>6. «Недвижимость постепенно превращается в актив». Сколько казахстанцев имеет жилье (13.07.2026)</w:t>
+      </w:r>
+    </w:p>
+    <w:p>
+      <w:r>
+        <w:t>[https://tengrinews.kz/tengri-home/article/nedvizimost-postepenno-prevrashhaetsia-aktiv-skolko-4224/](https://tengrinews.kz/tengri-home/article/nedvizimost-postepenno-prevrashhaetsia-aktiv-skolko-4224/)</w:t>
       </w:r>
     </w:p>
     <w:sectPr>

</xml_diff>